<commit_message>
Update documentation to address partner feedback on mirroring
Update CuraLive Mirroring Brief document to incorporate partner feedback, enhancing sections on telephony independence, health monitoring, cost positioning, and call quality.

Replit-Commit-Author: Agent
Replit-Commit-Session-Id: 0cbe7a84-a7a6-4a51-b09c-2be09cbda9ee
Replit-Commit-Checkpoint-Type: full_checkpoint
Replit-Commit-Event-Id: 67c71eb8-940d-4bb2-ace2-207749e4d59a
Replit-Commit-Screenshot-Url: https://storage.googleapis.com/screenshot-production-us-central1/1f99a8d9-3543-48bc-8564-b0463564e29d/0cbe7a84-a7a6-4a51-b09c-2be09cbda9ee/4sTB8Q4
</commit_message>
<xml_diff>
--- a/public/CuraLive_Mirroring_Brief.docx
+++ b/public/CuraLive_Mirroring_Brief.docx
@@ -68,6 +68,22 @@
               <w:t xml:space="preserve">Multi-Region Mirroring &amp; Infrastructure Brief</w:t>
             </w:r>
           </w:p>
+          <w:p>
+            <w:pPr>
+              <w:spacing w:after="0" w:before="50"/>
+              <w:jc w:val="center"/>
+            </w:pPr>
+            <w:r>
+              <w:rPr>
+                <w:b w:val="false"/>
+                <w:bCs w:val="false"/>
+                <w:color w:val="FFFFFF"/>
+                <w:sz w:val="20"/>
+                <w:szCs w:val="20"/>
+              </w:rPr>
+              <w:t xml:space="preserve">v2 — Updated with Partner Feedback</w:t>
+            </w:r>
+          </w:p>
         </w:tc>
       </w:tr>
     </w:tbl>
@@ -87,7 +103,7 @@
           <w:sz w:val="20"/>
           <w:szCs w:val="20"/>
         </w:rPr>
-        <w:t xml:space="preserve">Prepared for partner review. This document covers why multi-region mirroring matters for CuraLive, what it involves, how much it costs, and what the platform already has in place to support it.</w:t>
+        <w:t xml:space="preserve">This document covers why multi-region mirroring matters for CuraLive, what it involves, how much it costs, and what the platform already has in place to support it. Updated to address partner review feedback.</w:t>
       </w:r>
     </w:p>
     <w:p>
@@ -231,7 +247,7 @@
           <w:sz w:val="21"/>
           <w:szCs w:val="21"/>
         </w:rPr>
-        <w:t xml:space="preserve">•  Telephony (phone calls) continues uninterrupted — Twilio already operates globally</w:t>
+        <w:t xml:space="preserve">•  Clients in different geographies get faster, lower-latency connections</w:t>
       </w:r>
     </w:p>
     <w:p>
@@ -247,25 +263,147 @@
           <w:sz w:val="21"/>
           <w:szCs w:val="21"/>
         </w:rPr>
-        <w:t xml:space="preserve">•  Clients in different geographies get faster, lower-latency connections</w:t>
-      </w:r>
-    </w:p>
-    <w:p>
-      <w:pPr>
-        <w:spacing w:after="0" w:before="80"/>
-        <w:ind w:left="360"/>
-      </w:pPr>
-      <w:r>
-        <w:rPr>
-          <w:b w:val="false"/>
-          <w:bCs w:val="false"/>
-          <w:color w:val="1F2937"/>
-          <w:sz w:val="21"/>
-          <w:szCs w:val="21"/>
-        </w:rPr>
         <w:t xml:space="preserve">•  Regulatory compliance — some jurisdictions require data to stay within their borders</w:t>
       </w:r>
     </w:p>
+    <w:p>
+      <w:pPr>
+        <w:spacing w:after="0" w:before="40"/>
+      </w:pPr>
+    </w:p>
+    <w:tbl>
+      <w:tblPr>
+        <w:tblW w:type="dxa" w:w="9000"/>
+        <w:tblBorders>
+          <w:top w:val="none" w:color="FFFFFF" w:sz="0"/>
+          <w:left w:val="none" w:color="FFFFFF" w:sz="0"/>
+          <w:bottom w:val="none" w:color="FFFFFF" w:sz="0"/>
+          <w:right w:val="none" w:color="FFFFFF" w:sz="0"/>
+          <w:insideH w:val="single" w:color="auto" w:sz="4"/>
+          <w:insideV w:val="single" w:color="auto" w:sz="4"/>
+        </w:tblBorders>
+      </w:tblPr>
+      <w:tblGrid>
+        <w:gridCol w:w="100"/>
+      </w:tblGrid>
+      <w:tr>
+        <w:tc>
+          <w:tcPr>
+            <w:tcW w:type="dxa" w:w="9000"/>
+            <w:tcBorders>
+              <w:top w:val="none" w:color="FFFFFF" w:sz="0"/>
+              <w:left w:val="none" w:color="FFFFFF" w:sz="0"/>
+              <w:bottom w:val="none" w:color="FFFFFF" w:sz="0"/>
+              <w:right w:val="none" w:color="FFFFFF" w:sz="0"/>
+            </w:tcBorders>
+            <w:shd w:color="065F46" w:val="solid"/>
+            <w:tcMar>
+              <w:top w:type="dxa" w:w="160"/>
+              <w:left w:type="dxa" w:w="280"/>
+              <w:bottom w:type="dxa" w:w="160"/>
+              <w:right w:type="dxa" w:w="280"/>
+            </w:tcMar>
+            <w:vAlign w:val="center"/>
+          </w:tcPr>
+          <w:p>
+            <w:pPr>
+              <w:spacing w:after="0" w:before="0"/>
+              <w:jc w:val="center"/>
+            </w:pPr>
+            <w:r>
+              <w:rPr>
+                <w:b/>
+                <w:bCs/>
+                <w:color w:val="FFFFFF"/>
+                <w:sz w:val="26"/>
+                <w:szCs w:val="26"/>
+              </w:rPr>
+              <w:t xml:space="preserve">Telephony Independence — Critical for Enterprise Clients</w:t>
+            </w:r>
+          </w:p>
+          <w:p>
+            <w:pPr>
+              <w:spacing w:after="0" w:before="50"/>
+              <w:jc w:val="center"/>
+            </w:pPr>
+            <w:r>
+              <w:rPr>
+                <w:b w:val="false"/>
+                <w:bCs w:val="false"/>
+                <w:color w:val="FFFFFF"/>
+                <w:sz w:val="20"/>
+                <w:szCs w:val="20"/>
+              </w:rPr>
+              <w:t xml:space="preserve"/>
+            </w:r>
+          </w:p>
+          <w:p>
+            <w:pPr>
+              <w:spacing w:after="0" w:before="50"/>
+              <w:jc w:val="center"/>
+            </w:pPr>
+            <w:r>
+              <w:rPr>
+                <w:b w:val="false"/>
+                <w:bCs w:val="false"/>
+                <w:color w:val="FFFFFF"/>
+                <w:sz w:val="20"/>
+                <w:szCs w:val="20"/>
+              </w:rPr>
+              <w:t xml:space="preserve">Active phone calls are managed entirely by Twilio’s global infrastructure and are completely</w:t>
+            </w:r>
+          </w:p>
+          <w:p>
+            <w:pPr>
+              <w:spacing w:after="0" w:before="50"/>
+              <w:jc w:val="center"/>
+            </w:pPr>
+            <w:r>
+              <w:rPr>
+                <w:b w:val="false"/>
+                <w:bCs w:val="false"/>
+                <w:color w:val="FFFFFF"/>
+                <w:sz w:val="20"/>
+                <w:szCs w:val="20"/>
+              </w:rPr>
+              <w:t xml:space="preserve">independent of CuraLive’s application servers. A CuraLive server failover does not interrupt</w:t>
+            </w:r>
+          </w:p>
+          <w:p>
+            <w:pPr>
+              <w:spacing w:after="0" w:before="50"/>
+              <w:jc w:val="center"/>
+            </w:pPr>
+            <w:r>
+              <w:rPr>
+                <w:b w:val="false"/>
+                <w:bCs w:val="false"/>
+                <w:color w:val="FFFFFF"/>
+                <w:sz w:val="20"/>
+                <w:szCs w:val="20"/>
+              </w:rPr>
+              <w:t xml:space="preserve">any call in progress. This is a key differentiator for enterprise clients, especially banks and</w:t>
+            </w:r>
+          </w:p>
+          <w:p>
+            <w:pPr>
+              <w:spacing w:after="0" w:before="50"/>
+              <w:jc w:val="center"/>
+            </w:pPr>
+            <w:r>
+              <w:rPr>
+                <w:b w:val="false"/>
+                <w:bCs w:val="false"/>
+                <w:color w:val="FFFFFF"/>
+                <w:sz w:val="20"/>
+                <w:szCs w:val="20"/>
+              </w:rPr>
+              <w:t xml:space="preserve">financial institutions where call continuity during live investor events is non-negotiable.</w:t>
+            </w:r>
+          </w:p>
+        </w:tc>
+      </w:tr>
+    </w:tbl>
     <w:p>
       <w:pPr>
         <w:spacing w:after="0" w:before="40"/>
@@ -282,7 +420,7 @@
           <w:sz w:val="21"/>
           <w:szCs w:val="21"/>
         </w:rPr>
-        <w:t xml:space="preserve">For acquisition readiness (Microsoft, Zoom, or similar), demonstrating multi-region resilience is a significant differentiator. It shows the platform is production-grade and ready for enterprise deployment.</w:t>
+        <w:t xml:space="preserve">Multi-region mirroring is not a future nice-to-have — it is a requirement for enterprise client acquisition. Financial institutions will require documented disaster recovery and business continuity capabilities during their vendor due diligence process.</w:t>
       </w:r>
     </w:p>
     <w:p>
@@ -1232,7 +1370,7 @@
           <w:sz w:val="21"/>
           <w:szCs w:val="21"/>
         </w:rPr>
-        <w:t xml:space="preserve">Health check detects the failure within 30–60 seconds</w:t>
+        <w:t xml:space="preserve">Health check detects the failure within 10–30 seconds (see Health Monitoring below)</w:t>
       </w:r>
     </w:p>
     <w:p>
@@ -1400,6 +1538,317 @@
                 <w:szCs w:val="20"/>
               </w:rPr>
               <w:t xml:space="preserve">Twilio manages call audio independently. Only the OCC dashboard reconnects.</w:t>
+            </w:r>
+          </w:p>
+          <w:p>
+            <w:pPr>
+              <w:spacing w:after="0" w:before="50"/>
+              <w:jc w:val="center"/>
+            </w:pPr>
+            <w:r>
+              <w:rPr>
+                <w:b w:val="false"/>
+                <w:bCs w:val="false"/>
+                <w:color w:val="FFFFFF"/>
+                <w:sz w:val="20"/>
+                <w:szCs w:val="20"/>
+              </w:rPr>
+              <w:t xml:space="preserve">This applies to native CuraLive calls, dial-out calls, and Shadow Bridge connections.</w:t>
+            </w:r>
+          </w:p>
+        </w:tc>
+      </w:tr>
+    </w:tbl>
+    <w:p>
+      <w:pPr>
+        <w:spacing w:after="0" w:before="100"/>
+      </w:pPr>
+    </w:p>
+    <w:p>
+      <w:pPr>
+        <w:spacing w:after="100" w:before="300"/>
+      </w:pPr>
+      <w:r>
+        <w:rPr>
+          <w:b/>
+          <w:bCs/>
+          <w:color w:val="1E3A8A"/>
+          <w:sz w:val="24"/>
+          <w:szCs w:val="24"/>
+        </w:rPr>
+        <w:t xml:space="preserve">Health Monitoring — How Failures Are Detected</w:t>
+      </w:r>
+    </w:p>
+    <w:p>
+      <w:pPr>
+        <w:spacing w:after="0" w:before="40"/>
+      </w:pPr>
+    </w:p>
+    <w:p>
+      <w:pPr>
+        <w:spacing w:after="120" w:before="120"/>
+        <w:ind w:left="200"/>
+      </w:pPr>
+      <w:r>
+        <w:rPr>
+          <w:color w:val="374151"/>
+          <w:sz w:val="21"/>
+          <w:szCs w:val="21"/>
+        </w:rPr>
+        <w:t xml:space="preserve">Health checks are performed by the cloud provider’s DNS failover service (e.g. AWS Route 53, Cloudflare). These are polling-based checks that send a request to the application server at regular intervals.</w:t>
+      </w:r>
+    </w:p>
+    <w:p>
+      <w:pPr>
+        <w:spacing w:after="0" w:before="20"/>
+      </w:pPr>
+    </w:p>
+    <w:p>
+      <w:pPr>
+        <w:spacing w:after="120" w:before="120"/>
+        <w:ind w:left="200"/>
+      </w:pPr>
+      <w:r>
+        <w:rPr>
+          <w:color w:val="374151"/>
+          <w:sz w:val="21"/>
+          <w:szCs w:val="21"/>
+        </w:rPr>
+        <w:t xml:space="preserve">Default configuration:</w:t>
+      </w:r>
+    </w:p>
+    <w:p>
+      <w:pPr>
+        <w:spacing w:after="0" w:before="80"/>
+        <w:ind w:left="360"/>
+      </w:pPr>
+      <w:r>
+        <w:rPr>
+          <w:b w:val="false"/>
+          <w:bCs w:val="false"/>
+          <w:color w:val="1F2937"/>
+          <w:sz w:val="21"/>
+          <w:szCs w:val="21"/>
+        </w:rPr>
+        <w:t xml:space="preserve">•  Standard health check interval: every 10–30 seconds</w:t>
+      </w:r>
+    </w:p>
+    <w:p>
+      <w:pPr>
+        <w:spacing w:after="0" w:before="80"/>
+        <w:ind w:left="360"/>
+      </w:pPr>
+      <w:r>
+        <w:rPr>
+          <w:b w:val="false"/>
+          <w:bCs w:val="false"/>
+          <w:color w:val="1F2937"/>
+          <w:sz w:val="21"/>
+          <w:szCs w:val="21"/>
+        </w:rPr>
+        <w:t xml:space="preserve">•  Configurable down to every 5 seconds for faster detection</w:t>
+      </w:r>
+    </w:p>
+    <w:p>
+      <w:pPr>
+        <w:spacing w:after="0" w:before="80"/>
+        <w:ind w:left="360"/>
+      </w:pPr>
+      <w:r>
+        <w:rPr>
+          <w:b w:val="false"/>
+          <w:bCs w:val="false"/>
+          <w:color w:val="1F2937"/>
+          <w:sz w:val="21"/>
+          <w:szCs w:val="21"/>
+        </w:rPr>
+        <w:t xml:space="preserve">•  Checks run from multiple geographic locations simultaneously</w:t>
+      </w:r>
+    </w:p>
+    <w:p>
+      <w:pPr>
+        <w:spacing w:after="0" w:before="80"/>
+        <w:ind w:left="360"/>
+      </w:pPr>
+      <w:r>
+        <w:rPr>
+          <w:b w:val="false"/>
+          <w:bCs w:val="false"/>
+          <w:color w:val="1F2937"/>
+          <w:sz w:val="21"/>
+          <w:szCs w:val="21"/>
+        </w:rPr>
+        <w:t xml:space="preserve">•  Failure is confirmed only when multiple check locations agree — preventing false positives</w:t>
+      </w:r>
+    </w:p>
+    <w:p>
+      <w:pPr>
+        <w:spacing w:after="0" w:before="40"/>
+      </w:pPr>
+    </w:p>
+    <w:p>
+      <w:pPr>
+        <w:spacing w:after="120" w:before="120"/>
+        <w:ind w:left="200"/>
+      </w:pPr>
+      <w:r>
+        <w:rPr>
+          <w:color w:val="374151"/>
+          <w:sz w:val="21"/>
+          <w:szCs w:val="21"/>
+        </w:rPr>
+        <w:t xml:space="preserve">In addition to basic server health checks, CuraLive supports application-level health monitoring that verifies:</w:t>
+      </w:r>
+    </w:p>
+    <w:p>
+      <w:pPr>
+        <w:spacing w:after="0" w:before="80"/>
+        <w:ind w:left="360"/>
+      </w:pPr>
+      <w:r>
+        <w:rPr>
+          <w:b w:val="false"/>
+          <w:bCs w:val="false"/>
+          <w:color w:val="1F2937"/>
+          <w:sz w:val="21"/>
+          <w:szCs w:val="21"/>
+        </w:rPr>
+        <w:t xml:space="preserve">•  Database connectivity — is the PostgreSQL connection active and responsive?</w:t>
+      </w:r>
+    </w:p>
+    <w:p>
+      <w:pPr>
+        <w:spacing w:after="0" w:before="80"/>
+        <w:ind w:left="360"/>
+      </w:pPr>
+      <w:r>
+        <w:rPr>
+          <w:b w:val="false"/>
+          <w:bCs w:val="false"/>
+          <w:color w:val="1F2937"/>
+          <w:sz w:val="21"/>
+          <w:szCs w:val="21"/>
+        </w:rPr>
+        <w:t xml:space="preserve">•  Telephony status — is the Twilio API reachable and authenticated?</w:t>
+      </w:r>
+    </w:p>
+    <w:p>
+      <w:pPr>
+        <w:spacing w:after="0" w:before="80"/>
+        <w:ind w:left="360"/>
+      </w:pPr>
+      <w:r>
+        <w:rPr>
+          <w:b w:val="false"/>
+          <w:bCs w:val="false"/>
+          <w:color w:val="1F2937"/>
+          <w:sz w:val="21"/>
+          <w:szCs w:val="21"/>
+        </w:rPr>
+        <w:t xml:space="preserve">•  AI service availability — is the OpenAI API responding?</w:t>
+      </w:r>
+    </w:p>
+    <w:p>
+      <w:pPr>
+        <w:spacing w:after="0" w:before="80"/>
+        <w:ind w:left="360"/>
+      </w:pPr>
+      <w:r>
+        <w:rPr>
+          <w:b w:val="false"/>
+          <w:bCs w:val="false"/>
+          <w:color w:val="1F2937"/>
+          <w:sz w:val="21"/>
+          <w:szCs w:val="21"/>
+        </w:rPr>
+        <w:t xml:space="preserve">•  Active event status — are events currently in progress still streaming correctly?</w:t>
+      </w:r>
+    </w:p>
+    <w:p>
+      <w:pPr>
+        <w:spacing w:after="0" w:before="40"/>
+      </w:pPr>
+    </w:p>
+    <w:tbl>
+      <w:tblPr>
+        <w:tblW w:type="dxa" w:w="9000"/>
+        <w:tblBorders>
+          <w:top w:val="none" w:color="FFFFFF" w:sz="0"/>
+          <w:left w:val="none" w:color="FFFFFF" w:sz="0"/>
+          <w:bottom w:val="none" w:color="FFFFFF" w:sz="0"/>
+          <w:right w:val="none" w:color="FFFFFF" w:sz="0"/>
+          <w:insideH w:val="single" w:color="auto" w:sz="4"/>
+          <w:insideV w:val="single" w:color="auto" w:sz="4"/>
+        </w:tblBorders>
+      </w:tblPr>
+      <w:tblGrid>
+        <w:gridCol w:w="100"/>
+      </w:tblGrid>
+      <w:tr>
+        <w:tc>
+          <w:tcPr>
+            <w:tcW w:type="dxa" w:w="9000"/>
+            <w:tcBorders>
+              <w:top w:val="none" w:color="FFFFFF" w:sz="0"/>
+              <w:left w:val="none" w:color="FFFFFF" w:sz="0"/>
+              <w:bottom w:val="none" w:color="FFFFFF" w:sz="0"/>
+              <w:right w:val="none" w:color="FFFFFF" w:sz="0"/>
+            </w:tcBorders>
+            <w:shd w:color="374151" w:val="solid"/>
+            <w:tcMar>
+              <w:top w:type="dxa" w:w="160"/>
+              <w:left w:type="dxa" w:w="280"/>
+              <w:bottom w:type="dxa" w:w="160"/>
+              <w:right w:type="dxa" w:w="280"/>
+            </w:tcMar>
+            <w:vAlign w:val="center"/>
+          </w:tcPr>
+          <w:p>
+            <w:pPr>
+              <w:spacing w:after="0" w:before="0"/>
+              <w:jc w:val="center"/>
+            </w:pPr>
+            <w:r>
+              <w:rPr>
+                <w:b/>
+                <w:bCs/>
+                <w:color w:val="FFFFFF"/>
+                <w:sz w:val="26"/>
+                <w:szCs w:val="26"/>
+              </w:rPr>
+              <w:t xml:space="preserve">Application-level health checks go beyond simple “is the server up” monitoring.</w:t>
+            </w:r>
+          </w:p>
+          <w:p>
+            <w:pPr>
+              <w:spacing w:after="0" w:before="50"/>
+              <w:jc w:val="center"/>
+            </w:pPr>
+            <w:r>
+              <w:rPr>
+                <w:b w:val="false"/>
+                <w:bCs w:val="false"/>
+                <w:color w:val="FFFFFF"/>
+                <w:sz w:val="20"/>
+                <w:szCs w:val="20"/>
+              </w:rPr>
+              <w:t xml:space="preserve">They verify that every critical service the platform depends on is operational.</w:t>
+            </w:r>
+          </w:p>
+          <w:p>
+            <w:pPr>
+              <w:spacing w:after="0" w:before="50"/>
+              <w:jc w:val="center"/>
+            </w:pPr>
+            <w:r>
+              <w:rPr>
+                <w:b w:val="false"/>
+                <w:bCs w:val="false"/>
+                <w:color w:val="FFFFFF"/>
+                <w:sz w:val="20"/>
+                <w:szCs w:val="20"/>
+              </w:rPr>
+              <w:t xml:space="preserve">This is the level of monitoring enterprise IT and audit teams expect to see.</w:t>
             </w:r>
           </w:p>
         </w:tc>
@@ -2912,12 +3361,134 @@
       <w:r>
         <w:rPr>
           <w:color w:val="374151"/>
-          <w:sz w:val="19"/>
-          <w:szCs w:val="19"/>
-        </w:rPr>
-        <w:t xml:space="preserve">At enterprise tier with SLA guarantees and active-active: $2,000 – $5,000/month. This is still very competitive compared to legacy conferencing platforms which charge $10,000–$50,000/month for equivalent setups.</w:t>
-      </w:r>
-    </w:p>
+          <w:sz w:val="21"/>
+          <w:szCs w:val="21"/>
+        </w:rPr>
+        <w:t xml:space="preserve">At enterprise tier with SLA guarantees and active-active: $2,000 – $5,000/month.</w:t>
+      </w:r>
+    </w:p>
+    <w:p>
+      <w:pPr>
+        <w:spacing w:after="0" w:before="20"/>
+      </w:pPr>
+    </w:p>
+    <w:tbl>
+      <w:tblPr>
+        <w:tblW w:type="dxa" w:w="9000"/>
+        <w:tblBorders>
+          <w:top w:val="none" w:color="FFFFFF" w:sz="0"/>
+          <w:left w:val="none" w:color="FFFFFF" w:sz="0"/>
+          <w:bottom w:val="none" w:color="FFFFFF" w:sz="0"/>
+          <w:right w:val="none" w:color="FFFFFF" w:sz="0"/>
+          <w:insideH w:val="single" w:color="auto" w:sz="4"/>
+          <w:insideV w:val="single" w:color="auto" w:sz="4"/>
+        </w:tblBorders>
+      </w:tblPr>
+      <w:tblGrid>
+        <w:gridCol w:w="100"/>
+      </w:tblGrid>
+      <w:tr>
+        <w:tc>
+          <w:tcPr>
+            <w:tcW w:type="dxa" w:w="9000"/>
+            <w:tcBorders>
+              <w:top w:val="none" w:color="FFFFFF" w:sz="0"/>
+              <w:left w:val="none" w:color="FFFFFF" w:sz="0"/>
+              <w:bottom w:val="none" w:color="FFFFFF" w:sz="0"/>
+              <w:right w:val="none" w:color="FFFFFF" w:sz="0"/>
+            </w:tcBorders>
+            <w:shd w:color="065F46" w:val="solid"/>
+            <w:tcMar>
+              <w:top w:type="dxa" w:w="160"/>
+              <w:left w:type="dxa" w:w="280"/>
+              <w:bottom w:type="dxa" w:w="160"/>
+              <w:right w:type="dxa" w:w="280"/>
+            </w:tcMar>
+            <w:vAlign w:val="center"/>
+          </w:tcPr>
+          <w:p>
+            <w:pPr>
+              <w:spacing w:after="0" w:before="0"/>
+              <w:jc w:val="center"/>
+            </w:pPr>
+            <w:r>
+              <w:rPr>
+                <w:b/>
+                <w:bCs/>
+                <w:color w:val="FFFFFF"/>
+                <w:sz w:val="26"/>
+                <w:szCs w:val="26"/>
+              </w:rPr>
+              <w:t xml:space="preserve">For context: legacy conferencing platforms charge $10,000–$50,000/month</w:t>
+            </w:r>
+          </w:p>
+          <w:p>
+            <w:pPr>
+              <w:spacing w:after="0" w:before="50"/>
+              <w:jc w:val="center"/>
+            </w:pPr>
+            <w:r>
+              <w:rPr>
+                <w:b w:val="false"/>
+                <w:bCs w:val="false"/>
+                <w:color w:val="FFFFFF"/>
+                <w:sz w:val="20"/>
+                <w:szCs w:val="20"/>
+              </w:rPr>
+              <w:t xml:space="preserve">for equivalent multi-region setups. CuraLive delivers the same resilience</w:t>
+            </w:r>
+          </w:p>
+          <w:p>
+            <w:pPr>
+              <w:spacing w:after="0" w:before="50"/>
+              <w:jc w:val="center"/>
+            </w:pPr>
+            <w:r>
+              <w:rPr>
+                <w:b w:val="false"/>
+                <w:bCs w:val="false"/>
+                <w:color w:val="FFFFFF"/>
+                <w:sz w:val="20"/>
+                <w:szCs w:val="20"/>
+              </w:rPr>
+              <w:t xml:space="preserve">at a fraction of the cost. This cost advantage will be critical when</w:t>
+            </w:r>
+          </w:p>
+          <w:p>
+            <w:pPr>
+              <w:spacing w:after="0" w:before="50"/>
+              <w:jc w:val="center"/>
+            </w:pPr>
+            <w:r>
+              <w:rPr>
+                <w:b w:val="false"/>
+                <w:bCs w:val="false"/>
+                <w:color w:val="FFFFFF"/>
+                <w:sz w:val="20"/>
+                <w:szCs w:val="20"/>
+              </w:rPr>
+              <w:t xml:space="preserve">enterprise clients’ internal IT and audit teams scrutinise the platform</w:t>
+            </w:r>
+          </w:p>
+          <w:p>
+            <w:pPr>
+              <w:spacing w:after="0" w:before="50"/>
+              <w:jc w:val="center"/>
+            </w:pPr>
+            <w:r>
+              <w:rPr>
+                <w:b w:val="false"/>
+                <w:bCs w:val="false"/>
+                <w:color w:val="FFFFFF"/>
+                <w:sz w:val="20"/>
+                <w:szCs w:val="20"/>
+              </w:rPr>
+              <w:t xml:space="preserve">during vendor assessment and procurement.</w:t>
+            </w:r>
+          </w:p>
+        </w:tc>
+      </w:tr>
+    </w:tbl>
     <w:p>
       <w:pPr>
         <w:spacing w:after="0" w:before="200"/>
@@ -3574,6 +4145,523 @@
     </w:tbl>
     <w:p>
       <w:pPr>
+        <w:spacing w:after="0" w:before="100"/>
+      </w:pPr>
+    </w:p>
+    <w:p>
+      <w:pPr>
+        <w:spacing w:after="100" w:before="300"/>
+      </w:pPr>
+      <w:r>
+        <w:rPr>
+          <w:b/>
+          <w:bCs/>
+          <w:color w:val="1E3A8A"/>
+          <w:sz w:val="24"/>
+          <w:szCs w:val="24"/>
+        </w:rPr>
+        <w:t xml:space="preserve">Call Quality Monitoring</w:t>
+      </w:r>
+    </w:p>
+    <w:p>
+      <w:pPr>
+        <w:spacing w:after="0" w:before="40"/>
+      </w:pPr>
+    </w:p>
+    <w:p>
+      <w:pPr>
+        <w:spacing w:after="120" w:before="120"/>
+        <w:ind w:left="200"/>
+      </w:pPr>
+      <w:r>
+        <w:rPr>
+          <w:color w:val="374151"/>
+          <w:sz w:val="21"/>
+          <w:szCs w:val="21"/>
+        </w:rPr>
+        <w:t xml:space="preserve">For enterprise operations, visibility into call quality at the network level is essential — especially when running events for banks and financial institutions where audio quality complaints must be investigated and resolved quickly.</w:t>
+      </w:r>
+    </w:p>
+    <w:p>
+      <w:pPr>
+        <w:spacing w:after="0" w:before="20"/>
+      </w:pPr>
+    </w:p>
+    <w:p>
+      <w:pPr>
+        <w:spacing w:after="120" w:before="120"/>
+        <w:ind w:left="200"/>
+      </w:pPr>
+      <w:r>
+        <w:rPr>
+          <w:color w:val="374151"/>
+          <w:sz w:val="21"/>
+          <w:szCs w:val="21"/>
+        </w:rPr>
+        <w:t xml:space="preserve">CuraLive supports call quality monitoring through the following capabilities:</w:t>
+      </w:r>
+    </w:p>
+    <w:p>
+      <w:pPr>
+        <w:spacing w:after="0" w:before="20"/>
+      </w:pPr>
+    </w:p>
+    <w:tbl>
+      <w:tblPr>
+        <w:tblW w:type="dxa" w:w="9000"/>
+        <w:tblBorders>
+          <w:top w:val="none" w:color="FFFFFF" w:sz="0"/>
+          <w:left w:val="none" w:color="FFFFFF" w:sz="0"/>
+          <w:bottom w:val="none" w:color="FFFFFF" w:sz="0"/>
+          <w:right w:val="none" w:color="FFFFFF" w:sz="0"/>
+          <w:insideH w:val="single" w:color="auto" w:sz="4"/>
+          <w:insideV w:val="single" w:color="auto" w:sz="4"/>
+        </w:tblBorders>
+      </w:tblPr>
+      <w:tblGrid>
+        <w:gridCol w:w="100"/>
+        <w:gridCol w:w="100"/>
+        <w:gridCol w:w="100"/>
+      </w:tblGrid>
+      <w:tr>
+        <w:tc>
+          <w:tcPr>
+            <w:tcW w:type="dxa" w:w="4380"/>
+            <w:tcBorders>
+              <w:top w:val="none" w:color="FFFFFF" w:sz="0"/>
+              <w:left w:val="none" w:color="FFFFFF" w:sz="0"/>
+              <w:bottom w:val="none" w:color="FFFFFF" w:sz="0"/>
+              <w:right w:val="none" w:color="FFFFFF" w:sz="0"/>
+            </w:tcBorders>
+            <w:shd w:color="5B21B6" w:val="solid"/>
+            <w:tcMar>
+              <w:top w:type="dxa" w:w="140"/>
+              <w:left w:type="dxa" w:w="200"/>
+              <w:bottom w:type="dxa" w:w="140"/>
+              <w:right w:type="dxa" w:w="200"/>
+            </w:tcMar>
+            <w:vAlign w:val="center"/>
+          </w:tcPr>
+          <w:p>
+            <w:pPr>
+              <w:spacing w:after="30" w:before="0"/>
+              <w:jc w:val="center"/>
+            </w:pPr>
+            <w:r>
+              <w:rPr>
+                <w:b/>
+                <w:bCs/>
+                <w:color w:val="FFFFFF"/>
+                <w:sz w:val="21"/>
+                <w:szCs w:val="21"/>
+              </w:rPr>
+              <w:t xml:space="preserve">Twilio Insights</w:t>
+            </w:r>
+          </w:p>
+          <w:p>
+            <w:pPr>
+              <w:spacing w:after="30" w:before="0"/>
+              <w:jc w:val="center"/>
+            </w:pPr>
+            <w:r>
+              <w:rPr>
+                <w:b w:val="false"/>
+                <w:bCs w:val="false"/>
+                <w:color w:val="FFFFFF"/>
+                <w:sz w:val="17"/>
+                <w:szCs w:val="17"/>
+              </w:rPr>
+              <w:t xml:space="preserve">(available now)</w:t>
+            </w:r>
+          </w:p>
+          <w:p>
+            <w:pPr>
+              <w:spacing w:after="30" w:before="0"/>
+              <w:jc w:val="center"/>
+            </w:pPr>
+            <w:r>
+              <w:rPr>
+                <w:b w:val="false"/>
+                <w:bCs w:val="false"/>
+                <w:color w:val="FFFFFF"/>
+                <w:sz w:val="17"/>
+                <w:szCs w:val="17"/>
+              </w:rPr>
+              <w:t xml:space="preserve"/>
+            </w:r>
+          </w:p>
+          <w:p>
+            <w:pPr>
+              <w:spacing w:after="30" w:before="0"/>
+              <w:jc w:val="center"/>
+            </w:pPr>
+            <w:r>
+              <w:rPr>
+                <w:b w:val="false"/>
+                <w:bCs w:val="false"/>
+                <w:color w:val="FFFFFF"/>
+                <w:sz w:val="17"/>
+                <w:szCs w:val="17"/>
+              </w:rPr>
+              <w:t xml:space="preserve">Per-call quality metrics</w:t>
+            </w:r>
+          </w:p>
+          <w:p>
+            <w:pPr>
+              <w:spacing w:after="30" w:before="0"/>
+              <w:jc w:val="center"/>
+            </w:pPr>
+            <w:r>
+              <w:rPr>
+                <w:b w:val="false"/>
+                <w:bCs w:val="false"/>
+                <w:color w:val="FFFFFF"/>
+                <w:sz w:val="17"/>
+                <w:szCs w:val="17"/>
+              </w:rPr>
+              <w:t xml:space="preserve">MOS scores (Mean Opinion Score)</w:t>
+            </w:r>
+          </w:p>
+          <w:p>
+            <w:pPr>
+              <w:spacing w:after="30" w:before="0"/>
+              <w:jc w:val="center"/>
+            </w:pPr>
+            <w:r>
+              <w:rPr>
+                <w:b w:val="false"/>
+                <w:bCs w:val="false"/>
+                <w:color w:val="FFFFFF"/>
+                <w:sz w:val="17"/>
+                <w:szCs w:val="17"/>
+              </w:rPr>
+              <w:t xml:space="preserve">Jitter, packet loss, latency</w:t>
+            </w:r>
+          </w:p>
+          <w:p>
+            <w:pPr>
+              <w:spacing w:after="30" w:before="0"/>
+              <w:jc w:val="center"/>
+            </w:pPr>
+            <w:r>
+              <w:rPr>
+                <w:b w:val="false"/>
+                <w:bCs w:val="false"/>
+                <w:color w:val="FFFFFF"/>
+                <w:sz w:val="17"/>
+                <w:szCs w:val="17"/>
+              </w:rPr>
+              <w:t xml:space="preserve">Per-participant breakdown</w:t>
+            </w:r>
+          </w:p>
+          <w:p>
+            <w:pPr>
+              <w:spacing w:after="30" w:before="0"/>
+              <w:jc w:val="center"/>
+            </w:pPr>
+            <w:r>
+              <w:rPr>
+                <w:b w:val="false"/>
+                <w:bCs w:val="false"/>
+                <w:color w:val="FFFFFF"/>
+                <w:sz w:val="17"/>
+                <w:szCs w:val="17"/>
+              </w:rPr>
+              <w:t xml:space="preserve">Historical call quality trends</w:t>
+            </w:r>
+          </w:p>
+        </w:tc>
+        <w:tc>
+          <w:tcPr>
+            <w:tcW w:type="dxa" w:w="240"/>
+            <w:tcBorders>
+              <w:top w:val="none" w:color="FFFFFF" w:sz="0"/>
+              <w:left w:val="none" w:color="FFFFFF" w:sz="0"/>
+              <w:bottom w:val="none" w:color="FFFFFF" w:sz="0"/>
+              <w:right w:val="none" w:color="FFFFFF" w:sz="0"/>
+            </w:tcBorders>
+          </w:tcPr>
+          <w:p/>
+        </w:tc>
+        <w:tc>
+          <w:tcPr>
+            <w:tcW w:type="dxa" w:w="4380"/>
+            <w:tcBorders>
+              <w:top w:val="none" w:color="FFFFFF" w:sz="0"/>
+              <w:left w:val="none" w:color="FFFFFF" w:sz="0"/>
+              <w:bottom w:val="none" w:color="FFFFFF" w:sz="0"/>
+              <w:right w:val="none" w:color="FFFFFF" w:sz="0"/>
+            </w:tcBorders>
+            <w:shd w:color="1E40AF" w:val="solid"/>
+            <w:tcMar>
+              <w:top w:type="dxa" w:w="140"/>
+              <w:left w:type="dxa" w:w="200"/>
+              <w:bottom w:type="dxa" w:w="140"/>
+              <w:right w:type="dxa" w:w="200"/>
+            </w:tcMar>
+            <w:vAlign w:val="center"/>
+          </w:tcPr>
+          <w:p>
+            <w:pPr>
+              <w:spacing w:after="30" w:before="0"/>
+              <w:jc w:val="center"/>
+            </w:pPr>
+            <w:r>
+              <w:rPr>
+                <w:b/>
+                <w:bCs/>
+                <w:color w:val="FFFFFF"/>
+                <w:sz w:val="21"/>
+                <w:szCs w:val="21"/>
+              </w:rPr>
+              <w:t xml:space="preserve">BYOC Carrier Dashboards</w:t>
+            </w:r>
+          </w:p>
+          <w:p>
+            <w:pPr>
+              <w:spacing w:after="30" w:before="0"/>
+              <w:jc w:val="center"/>
+            </w:pPr>
+            <w:r>
+              <w:rPr>
+                <w:b w:val="false"/>
+                <w:bCs w:val="false"/>
+                <w:color w:val="FFFFFF"/>
+                <w:sz w:val="17"/>
+                <w:szCs w:val="17"/>
+              </w:rPr>
+              <w:t xml:space="preserve">(available with BYOC)</w:t>
+            </w:r>
+          </w:p>
+          <w:p>
+            <w:pPr>
+              <w:spacing w:after="30" w:before="0"/>
+              <w:jc w:val="center"/>
+            </w:pPr>
+            <w:r>
+              <w:rPr>
+                <w:b w:val="false"/>
+                <w:bCs w:val="false"/>
+                <w:color w:val="FFFFFF"/>
+                <w:sz w:val="17"/>
+                <w:szCs w:val="17"/>
+              </w:rPr>
+              <w:t xml:space="preserve"/>
+            </w:r>
+          </w:p>
+          <w:p>
+            <w:pPr>
+              <w:spacing w:after="30" w:before="0"/>
+              <w:jc w:val="center"/>
+            </w:pPr>
+            <w:r>
+              <w:rPr>
+                <w:b w:val="false"/>
+                <w:bCs w:val="false"/>
+                <w:color w:val="FFFFFF"/>
+                <w:sz w:val="17"/>
+                <w:szCs w:val="17"/>
+              </w:rPr>
+              <w:t xml:space="preserve">Real-time call performance monitoring</w:t>
+            </w:r>
+          </w:p>
+          <w:p>
+            <w:pPr>
+              <w:spacing w:after="30" w:before="0"/>
+              <w:jc w:val="center"/>
+            </w:pPr>
+            <w:r>
+              <w:rPr>
+                <w:b w:val="false"/>
+                <w:bCs w:val="false"/>
+                <w:color w:val="FFFFFF"/>
+                <w:sz w:val="17"/>
+                <w:szCs w:val="17"/>
+              </w:rPr>
+              <w:t xml:space="preserve">Network-level quality metrics</w:t>
+            </w:r>
+          </w:p>
+          <w:p>
+            <w:pPr>
+              <w:spacing w:after="30" w:before="0"/>
+              <w:jc w:val="center"/>
+            </w:pPr>
+            <w:r>
+              <w:rPr>
+                <w:b w:val="false"/>
+                <w:bCs w:val="false"/>
+                <w:color w:val="FFFFFF"/>
+                <w:sz w:val="17"/>
+                <w:szCs w:val="17"/>
+              </w:rPr>
+              <w:t xml:space="preserve">Individual participant routing analysis</w:t>
+            </w:r>
+          </w:p>
+          <w:p>
+            <w:pPr>
+              <w:spacing w:after="30" w:before="0"/>
+              <w:jc w:val="center"/>
+            </w:pPr>
+            <w:r>
+              <w:rPr>
+                <w:b w:val="false"/>
+                <w:bCs w:val="false"/>
+                <w:color w:val="FFFFFF"/>
+                <w:sz w:val="17"/>
+                <w:szCs w:val="17"/>
+              </w:rPr>
+              <w:t xml:space="preserve">Latency rates, buffering, packet loss</w:t>
+            </w:r>
+          </w:p>
+          <w:p>
+            <w:pPr>
+              <w:spacing w:after="30" w:before="0"/>
+              <w:jc w:val="center"/>
+            </w:pPr>
+            <w:r>
+              <w:rPr>
+                <w:b w:val="false"/>
+                <w:bCs w:val="false"/>
+                <w:color w:val="FFFFFF"/>
+                <w:sz w:val="17"/>
+                <w:szCs w:val="17"/>
+              </w:rPr>
+              <w:t xml:space="preserve">Useful for complaint investigation</w:t>
+            </w:r>
+          </w:p>
+        </w:tc>
+      </w:tr>
+    </w:tbl>
+    <w:p>
+      <w:pPr>
+        <w:spacing w:after="0" w:before="40"/>
+      </w:pPr>
+    </w:p>
+    <w:p>
+      <w:pPr>
+        <w:spacing w:after="120" w:before="120"/>
+        <w:ind w:left="200"/>
+      </w:pPr>
+      <w:r>
+        <w:rPr>
+          <w:color w:val="374151"/>
+          <w:sz w:val="21"/>
+          <w:szCs w:val="21"/>
+        </w:rPr>
+        <w:t xml:space="preserve">Twilio Insights data can be surfaced directly within the CuraLive OCC, giving operators real-time visibility into call quality alongside the live transcript, sentiment scores, and compliance flags. This means operators can identify and respond to call quality issues during the event, not after.</w:t>
+      </w:r>
+    </w:p>
+    <w:p>
+      <w:pPr>
+        <w:spacing w:after="0" w:before="20"/>
+      </w:pPr>
+    </w:p>
+    <w:p>
+      <w:pPr>
+        <w:spacing w:after="120" w:before="120"/>
+        <w:ind w:left="200"/>
+      </w:pPr>
+      <w:r>
+        <w:rPr>
+          <w:color w:val="374151"/>
+          <w:sz w:val="21"/>
+          <w:szCs w:val="21"/>
+        </w:rPr>
+        <w:t xml:space="preserve">When BYOC is implemented, equivalent quality dashboards from the carrier (such as Bandwidth’s real-time performance dashboard or similar offerings from other SIP providers) can be integrated alongside Twilio’s metrics, providing comprehensive quality monitoring across all telephony paths.</w:t>
+      </w:r>
+    </w:p>
+    <w:p>
+      <w:pPr>
+        <w:spacing w:after="0" w:before="20"/>
+      </w:pPr>
+    </w:p>
+    <w:tbl>
+      <w:tblPr>
+        <w:tblW w:type="dxa" w:w="9000"/>
+        <w:tblBorders>
+          <w:top w:val="none" w:color="FFFFFF" w:sz="0"/>
+          <w:left w:val="none" w:color="FFFFFF" w:sz="0"/>
+          <w:bottom w:val="none" w:color="FFFFFF" w:sz="0"/>
+          <w:right w:val="none" w:color="FFFFFF" w:sz="0"/>
+          <w:insideH w:val="single" w:color="auto" w:sz="4"/>
+          <w:insideV w:val="single" w:color="auto" w:sz="4"/>
+        </w:tblBorders>
+      </w:tblPr>
+      <w:tblGrid>
+        <w:gridCol w:w="100"/>
+      </w:tblGrid>
+      <w:tr>
+        <w:tc>
+          <w:tcPr>
+            <w:tcW w:type="dxa" w:w="9000"/>
+            <w:tcBorders>
+              <w:top w:val="none" w:color="FFFFFF" w:sz="0"/>
+              <w:left w:val="none" w:color="FFFFFF" w:sz="0"/>
+              <w:bottom w:val="none" w:color="FFFFFF" w:sz="0"/>
+              <w:right w:val="none" w:color="FFFFFF" w:sz="0"/>
+            </w:tcBorders>
+            <w:shd w:color="374151" w:val="solid"/>
+            <w:tcMar>
+              <w:top w:type="dxa" w:w="160"/>
+              <w:left w:type="dxa" w:w="280"/>
+              <w:bottom w:type="dxa" w:w="160"/>
+              <w:right w:type="dxa" w:w="280"/>
+            </w:tcMar>
+            <w:vAlign w:val="center"/>
+          </w:tcPr>
+          <w:p>
+            <w:pPr>
+              <w:spacing w:after="0" w:before="0"/>
+              <w:jc w:val="center"/>
+            </w:pPr>
+            <w:r>
+              <w:rPr>
+                <w:b/>
+                <w:bCs/>
+                <w:color w:val="FFFFFF"/>
+                <w:sz w:val="26"/>
+                <w:szCs w:val="26"/>
+              </w:rPr>
+              <w:t xml:space="preserve">Call quality monitoring is an operational necessity for enterprise events.</w:t>
+            </w:r>
+          </w:p>
+          <w:p>
+            <w:pPr>
+              <w:spacing w:after="0" w:before="50"/>
+              <w:jc w:val="center"/>
+            </w:pPr>
+            <w:r>
+              <w:rPr>
+                <w:b w:val="false"/>
+                <w:bCs w:val="false"/>
+                <w:color w:val="FFFFFF"/>
+                <w:sz w:val="20"/>
+                <w:szCs w:val="20"/>
+              </w:rPr>
+              <w:t xml:space="preserve">The ability to investigate per-participant call quality in real time</w:t>
+            </w:r>
+          </w:p>
+          <w:p>
+            <w:pPr>
+              <w:spacing w:after="0" w:before="50"/>
+              <w:jc w:val="center"/>
+            </w:pPr>
+            <w:r>
+              <w:rPr>
+                <w:b w:val="false"/>
+                <w:bCs w:val="false"/>
+                <w:color w:val="FFFFFF"/>
+                <w:sz w:val="20"/>
+                <w:szCs w:val="20"/>
+              </w:rPr>
+              <w:t xml:space="preserve">is what separates a production platform from a prototype.</w:t>
+            </w:r>
+          </w:p>
+        </w:tc>
+      </w:tr>
+    </w:tbl>
+    <w:p>
+      <w:pPr>
         <w:spacing w:after="0" w:before="200"/>
       </w:pPr>
     </w:p>
@@ -3734,6 +4822,22 @@
     <w:p>
       <w:pPr>
         <w:spacing w:after="0" w:before="80"/>
+        <w:ind w:left="360"/>
+      </w:pPr>
+      <w:r>
+        <w:rPr>
+          <w:b/>
+          <w:bCs/>
+          <w:color w:val="1F2937"/>
+          <w:sz w:val="21"/>
+          <w:szCs w:val="21"/>
+        </w:rPr>
+        <w:t xml:space="preserve">•  Call quality metrics available via Twilio Insights API</w:t>
+      </w:r>
+    </w:p>
+    <w:p>
+      <w:pPr>
+        <w:spacing w:after="0" w:before="80"/>
       </w:pPr>
     </w:p>
     <w:p>
@@ -3868,7 +4972,7 @@
           <w:sz w:val="21"/>
           <w:szCs w:val="21"/>
         </w:rPr>
-        <w:t xml:space="preserve">Set up monitoring and health check alerts</w:t>
+        <w:t xml:space="preserve">Set up application-level health checks (DB, Twilio, AI, active events)</w:t>
       </w:r>
     </w:p>
     <w:p>
@@ -3892,6 +4996,54 @@
           <w:sz w:val="21"/>
           <w:szCs w:val="21"/>
         </w:rPr>
+        <w:t xml:space="preserve">Configure monitoring and alerting dashboards</w:t>
+      </w:r>
+    </w:p>
+    <w:p>
+      <w:pPr>
+        <w:spacing w:after="0" w:before="100"/>
+        <w:ind w:left="360"/>
+      </w:pPr>
+      <w:r>
+        <w:rPr>
+          <w:b/>
+          <w:bCs/>
+          <w:color w:val="374151"/>
+          <w:sz w:val="21"/>
+          <w:szCs w:val="21"/>
+        </w:rPr>
+        <w:t xml:space="preserve">7.  </w:t>
+      </w:r>
+      <w:r>
+        <w:rPr>
+          <w:color w:val="1F2937"/>
+          <w:sz w:val="21"/>
+          <w:szCs w:val="21"/>
+        </w:rPr>
+        <w:t xml:space="preserve">Integrate Twilio Insights call quality data into the OCC</w:t>
+      </w:r>
+    </w:p>
+    <w:p>
+      <w:pPr>
+        <w:spacing w:after="0" w:before="100"/>
+        <w:ind w:left="360"/>
+      </w:pPr>
+      <w:r>
+        <w:rPr>
+          <w:b/>
+          <w:bCs/>
+          <w:color w:val="374151"/>
+          <w:sz w:val="21"/>
+          <w:szCs w:val="21"/>
+        </w:rPr>
+        <w:t xml:space="preserve">8.  </w:t>
+      </w:r>
+      <w:r>
+        <w:rPr>
+          <w:color w:val="1F2937"/>
+          <w:sz w:val="21"/>
+          <w:szCs w:val="21"/>
+        </w:rPr>
         <w:t xml:space="preserve">Test failover with a simulated outage</w:t>
       </w:r>
     </w:p>
@@ -3911,7 +5063,7 @@
           <w:sz w:val="21"/>
           <w:szCs w:val="21"/>
         </w:rPr>
-        <w:t xml:space="preserve">Timeline: 2–4 weeks for a production-grade deployment with testing. No code changes required — this is purely infrastructure configuration.</w:t>
+        <w:t xml:space="preserve">Timeline: 2–4 weeks for a production-grade deployment with testing. No code changes required for mirroring — this is purely infrastructure configuration. Call quality integration is an additional 1–2 weeks of development.</w:t>
       </w:r>
     </w:p>
     <w:p>
@@ -3966,7 +5118,7 @@
                 <w:sz w:val="26"/>
                 <w:szCs w:val="26"/>
               </w:rPr>
-              <w:t xml:space="preserve">7.  Why This Matters for the Acquisition Story</w:t>
+              <w:t xml:space="preserve">7.  Why This Matters for Enterprise Sales</w:t>
             </w:r>
           </w:p>
         </w:tc>
@@ -4071,6 +5223,38 @@
           <w:szCs w:val="21"/>
         </w:rPr>
         <w:t xml:space="preserve">•  Zero-code migration — no application changes needed to move between clouds</w:t>
+      </w:r>
+    </w:p>
+    <w:p>
+      <w:pPr>
+        <w:spacing w:after="0" w:before="80"/>
+        <w:ind w:left="360"/>
+      </w:pPr>
+      <w:r>
+        <w:rPr>
+          <w:b w:val="false"/>
+          <w:bCs w:val="false"/>
+          <w:color w:val="1F2937"/>
+          <w:sz w:val="21"/>
+          <w:szCs w:val="21"/>
+        </w:rPr>
+        <w:t xml:space="preserve">•  Call quality visibility — per-participant quality metrics for enterprise-grade operations</w:t>
+      </w:r>
+    </w:p>
+    <w:p>
+      <w:pPr>
+        <w:spacing w:after="0" w:before="80"/>
+        <w:ind w:left="360"/>
+      </w:pPr>
+      <w:r>
+        <w:rPr>
+          <w:b w:val="false"/>
+          <w:bCs w:val="false"/>
+          <w:color w:val="1F2937"/>
+          <w:sz w:val="21"/>
+          <w:szCs w:val="21"/>
+        </w:rPr>
+        <w:t xml:space="preserve">•  Audit readiness — health monitoring, call quality logs, and failover documentation satisfy IT/audit scrutiny</w:t>
       </w:r>
     </w:p>
     <w:p>
@@ -4125,6 +5309,70 @@
                 <w:sz w:val="26"/>
                 <w:szCs w:val="26"/>
               </w:rPr>
+              <w:t xml:space="preserve">When enterprise clients’ internal IT and audit teams evaluate CuraLive,</w:t>
+            </w:r>
+          </w:p>
+          <w:p>
+            <w:pPr>
+              <w:spacing w:after="0" w:before="50"/>
+              <w:jc w:val="center"/>
+            </w:pPr>
+            <w:r>
+              <w:rPr>
+                <w:b w:val="false"/>
+                <w:bCs w:val="false"/>
+                <w:color w:val="FFFFFF"/>
+                <w:sz w:val="20"/>
+                <w:szCs w:val="20"/>
+              </w:rPr>
+              <w:t xml:space="preserve">they will ask about disaster recovery, business continuity, call quality monitoring,</w:t>
+            </w:r>
+          </w:p>
+          <w:p>
+            <w:pPr>
+              <w:spacing w:after="0" w:before="50"/>
+              <w:jc w:val="center"/>
+            </w:pPr>
+            <w:r>
+              <w:rPr>
+                <w:b w:val="false"/>
+                <w:bCs w:val="false"/>
+                <w:color w:val="FFFFFF"/>
+                <w:sz w:val="20"/>
+                <w:szCs w:val="20"/>
+              </w:rPr>
+              <w:t xml:space="preserve">and data residency. This document answers every one of those questions.</w:t>
+            </w:r>
+          </w:p>
+          <w:p>
+            <w:pPr>
+              <w:spacing w:after="0" w:before="50"/>
+              <w:jc w:val="center"/>
+            </w:pPr>
+            <w:r>
+              <w:rPr>
+                <w:b w:val="false"/>
+                <w:bCs w:val="false"/>
+                <w:color w:val="FFFFFF"/>
+                <w:sz w:val="20"/>
+                <w:szCs w:val="20"/>
+              </w:rPr>
+              <w:t xml:space="preserve"/>
+            </w:r>
+          </w:p>
+          <w:p>
+            <w:pPr>
+              <w:spacing w:after="0" w:before="50"/>
+              <w:jc w:val="center"/>
+            </w:pPr>
+            <w:r>
+              <w:rPr>
+                <w:b w:val="false"/>
+                <w:bCs w:val="false"/>
+                <w:color w:val="FFFFFF"/>
+                <w:sz w:val="20"/>
+                <w:szCs w:val="20"/>
+              </w:rPr>
               <w:t xml:space="preserve">CuraLive is designed to be acquired.</w:t>
             </w:r>
           </w:p>
@@ -4164,7 +5412,7 @@
           <w:sz w:val="16"/>
           <w:szCs w:val="16"/>
         </w:rPr>
-        <w:t xml:space="preserve">CuraLive  —  Confidential  |  2026/03/12</w:t>
+        <w:t xml:space="preserve">CuraLive  —  Confidential  |  v2 Updated with Partner Feedback  |  2026/03/13</w:t>
       </w:r>
     </w:p>
     <w:sectPr>

</xml_diff>